<commit_message>
Refactorizacion de proyecto - Se corrigen conflictos de estilos para el layout - Se separan logica de presentacion de la aplicacion - Se genera el componente de rutas - Se genera el componente de navegacion - Se independiza la logica de componentes comunes
Inicio de desarrollo

- Se inicia el desarrollo de la pantalla "Encuesta"
</commit_message>
<xml_diff>
--- a/src/docs/Recurso_Reconsideracion.docx
+++ b/src/docs/Recurso_Reconsideracion.docx
@@ -1,7 +1,17 @@
 
 <file path=word/document.xml><?xml version="1.0" encoding="utf-8"?>
-<w:document xmlns:wpc="http://schemas.microsoft.com/office/word/2010/wordprocessingCanvas" xmlns:cx="http://schemas.microsoft.com/office/drawing/2014/chartex" xmlns:cx1="http://schemas.microsoft.com/office/drawing/2015/9/8/chartex" xmlns:cx2="http://schemas.microsoft.com/office/drawing/2015/10/21/chartex" xmlns:cx3="http://schemas.microsoft.com/office/drawing/2016/5/9/chartex" xmlns:cx4="http://schemas.microsoft.com/office/drawing/2016/5/10/chartex" xmlns:cx5="http://schemas.microsoft.com/office/drawing/2016/5/11/chartex" xmlns:cx6="http://schemas.microsoft.com/office/drawing/2016/5/12/chartex" xmlns:cx7="http://schemas.microsoft.com/office/drawing/2016/5/13/chartex" xmlns:cx8="http://schemas.microsoft.com/office/drawing/2016/5/14/chartex" xmlns:mc="http://schemas.openxmlformats.org/markup-compatibility/2006" xmlns:aink="http://schemas.microsoft.com/office/drawing/2016/ink" xmlns:am3d="http://schemas.microsoft.com/office/drawing/2017/model3d" xmlns:o="urn:schemas-microsoft-com:office:office" xmlns:oel="http://schemas.microsoft.com/office/2019/extlst" xmlns:r="http://schemas.openxmlformats.org/officeDocument/2006/relationships" xmlns:m="http://schemas.openxmlformats.org/officeDocument/2006/math" xmlns:v="urn:schemas-microsoft-com:vml" xmlns:wp14="http://schemas.microsoft.com/office/word/2010/wordprocessingDrawing" xmlns:wp="http://schemas.openxmlformats.org/drawingml/2006/wordprocessingDrawing" xmlns:w10="urn:schemas-microsoft-com:office:word" xmlns:w="http://schemas.openxmlformats.org/wordprocessingml/2006/main" xmlns:w14="http://schemas.microsoft.com/office/word/2010/wordml" xmlns:w15="http://schemas.microsoft.com/office/word/2012/wordml" xmlns:w16cex="http://schemas.microsoft.com/office/word/2018/wordml/cex" xmlns:w16cid="http://schemas.microsoft.com/office/word/2016/wordml/cid" xmlns:w16="http://schemas.microsoft.com/office/word/2018/wordml" xmlns:w16du="http://schemas.microsoft.com/office/word/2023/wordml/word16du" xmlns:w16sdtdh="http://schemas.microsoft.com/office/word/2020/wordml/sdtdatahash" xmlns:w16sdtfl="http://schemas.microsoft.com/office/word/2024/wordml/sdtformatlock" xmlns:w16se="http://schemas.microsoft.com/office/word/2015/wordml/symex" xmlns:wpg="http://schemas.microsoft.com/office/word/2010/wordprocessingGroup" xmlns:wpi="http://schemas.microsoft.com/office/word/2010/wordprocessingInk" xmlns:wne="http://schemas.microsoft.com/office/word/2006/wordml" xmlns:wps="http://schemas.microsoft.com/office/word/2010/wordprocessingShape" mc:Ignorable="w14 w15 w16se w16cid w16 w16cex w16sdtdh w16sdtfl w16du wp14">
+<w:document xmlns:wpc="http://schemas.microsoft.com/office/word/2010/wordprocessingCanvas" xmlns:cx="http://schemas.microsoft.com/office/drawing/2014/chartex" xmlns:cx1="http://schemas.microsoft.com/office/drawing/2015/9/8/chartex" xmlns:cx2="http://schemas.microsoft.com/office/drawing/2015/10/21/chartex" xmlns:cx3="http://schemas.microsoft.com/office/drawing/2016/5/9/chartex" xmlns:cx4="http://schemas.microsoft.com/office/drawing/2016/5/10/chartex" xmlns:cx5="http://schemas.microsoft.com/office/drawing/2016/5/11/chartex" xmlns:cx6="http://schemas.microsoft.com/office/drawing/2016/5/12/chartex" xmlns:cx7="http://schemas.microsoft.com/office/drawing/2016/5/13/chartex" xmlns:cx8="http://schemas.microsoft.com/office/drawing/2016/5/14/chartex" xmlns:mc="http://schemas.openxmlformats.org/markup-compatibility/2006" xmlns:aink="http://schemas.microsoft.com/office/drawing/2016/ink" xmlns:am3d="http://schemas.microsoft.com/office/drawing/2017/model3d" xmlns:o="urn:schemas-microsoft-com:office:office" xmlns:oel="http://schemas.microsoft.com/office/2019/extlst" xmlns:r="http://schemas.openxmlformats.org/officeDocument/2006/relationships" xmlns:m="http://schemas.openxmlformats.org/officeDocument/2006/math" xmlns:v="urn:schemas-microsoft-com:vml" xmlns:wp14="http://schemas.microsoft.com/office/word/2010/wordprocessingDrawing" xmlns:wp="http://schemas.openxmlformats.org/drawingml/2006/wordprocessingDrawing" xmlns:w10="urn:schemas-microsoft-com:office:word" xmlns:w="http://schemas.openxmlformats.org/wordprocessingml/2006/main" xmlns:w14="http://schemas.microsoft.com/office/word/2010/wordml" xmlns:w15="http://schemas.microsoft.com/office/word/2012/wordml" xmlns:w16cei="http://schemas.microsoft.com/office/word/2026/wordml/cei" xmlns:w16cex="http://schemas.microsoft.com/office/word/2018/wordml/cex" xmlns:w16cid="http://schemas.microsoft.com/office/word/2016/wordml/cid" xmlns:w16="http://schemas.microsoft.com/office/word/2018/wordml" xmlns:w16du="http://schemas.microsoft.com/office/word/2023/wordml/word16du" xmlns:w16sdtdh="http://schemas.microsoft.com/office/word/2020/wordml/sdtdatahash" xmlns:w16sdtfl="http://schemas.microsoft.com/office/word/2024/wordml/sdtformatlock" xmlns:w16se="http://schemas.microsoft.com/office/word/2015/wordml/symex" xmlns:wpg="http://schemas.microsoft.com/office/word/2010/wordprocessingGroup" xmlns:wpi="http://schemas.microsoft.com/office/word/2010/wordprocessingInk" xmlns:wne="http://schemas.microsoft.com/office/word/2006/wordml" xmlns:wps="http://schemas.microsoft.com/office/word/2010/wordprocessingShape" mc:Ignorable="w14 w15 w16se w16cid w16 w16cex w16sdtdh w16sdtfl w16du wp14">
   <w:body>
+    <w:p>
+      <w:pPr>
+        <w:jc w:val="both"/>
+        <w:rPr>
+          <w:rFonts w:ascii="Arial" w:hAnsi="Arial" w:cs="Arial"/>
+          <w:sz w:val="24"/>
+          <w:szCs w:val="24"/>
+        </w:rPr>
+      </w:pPr>
+    </w:p>
     <w:p>
       <w:pPr>
         <w:jc w:val="both"/>
@@ -314,6 +324,7 @@
         </w:rPr>
         <w:t xml:space="preserve">, actuando en calidad de </w:t>
       </w:r>
+      <w:proofErr w:type="spellStart"/>
       <w:r>
         <w:rPr>
           <w:rFonts w:ascii="Arial" w:hAnsi="Arial" w:cs="Arial"/>
@@ -321,7 +332,17 @@
           <w:sz w:val="24"/>
           <w:szCs w:val="24"/>
         </w:rPr>
-        <w:t xml:space="preserve">propietario(a)/poseedor(a) </w:t>
+        <w:t>Actua_Como</w:t>
+      </w:r>
+      <w:proofErr w:type="spellEnd"/>
+      <w:r>
+        <w:rPr>
+          <w:rFonts w:ascii="Arial" w:hAnsi="Arial" w:cs="Arial"/>
+          <w:color w:val="FF0000"/>
+          <w:sz w:val="24"/>
+          <w:szCs w:val="24"/>
+        </w:rPr>
+        <w:t xml:space="preserve"> </w:t>
       </w:r>
       <w:r>
         <w:rPr>
@@ -364,15 +385,7 @@
           <w:sz w:val="24"/>
           <w:szCs w:val="24"/>
         </w:rPr>
-        <w:t>Numero_Identificacion</w:t>
-      </w:r>
-      <w:r>
-        <w:rPr>
-          <w:rFonts w:ascii="Arial" w:hAnsi="Arial" w:cs="Arial"/>
-          <w:sz w:val="24"/>
-          <w:szCs w:val="24"/>
-        </w:rPr>
-        <w:t>_Inmueble</w:t>
+        <w:t>Numero_Identificacion_Inmueble</w:t>
       </w:r>
       <w:proofErr w:type="spellEnd"/>
       <w:r>
@@ -428,14 +441,20 @@
     </w:p>
     <w:p>
       <w:pPr>
-        <w:spacing w:after="0"/>
-        <w:jc w:val="both"/>
-        <w:rPr>
-          <w:rFonts w:ascii="Arial" w:hAnsi="Arial" w:cs="Arial"/>
-          <w:sz w:val="24"/>
-          <w:szCs w:val="24"/>
-        </w:rPr>
-      </w:pPr>
+        <w:rPr>
+          <w:rFonts w:ascii="Arial" w:hAnsi="Arial" w:cs="Arial"/>
+          <w:sz w:val="24"/>
+          <w:szCs w:val="24"/>
+        </w:rPr>
+      </w:pPr>
+      <w:r>
+        <w:rPr>
+          <w:rFonts w:ascii="Arial" w:hAnsi="Arial" w:cs="Arial"/>
+          <w:sz w:val="24"/>
+          <w:szCs w:val="24"/>
+        </w:rPr>
+        <w:br w:type="page"/>
+      </w:r>
     </w:p>
     <w:p>
       <w:pPr>
@@ -459,6 +478,7 @@
           <w:szCs w:val="24"/>
           <w:u w:val="single"/>
         </w:rPr>
+        <w:lastRenderedPageBreak/>
         <w:t>FUNDAMENTOS DE HECHO Y DE DERECHO</w:t>
       </w:r>
     </w:p>
@@ -567,6 +587,14 @@
           <w:szCs w:val="24"/>
         </w:rPr>
       </w:pPr>
+      <w:r>
+        <w:rPr>
+          <w:rFonts w:ascii="Arial" w:hAnsi="Arial" w:cs="Arial"/>
+          <w:sz w:val="24"/>
+          <w:szCs w:val="24"/>
+        </w:rPr>
+        <w:br w:type="page"/>
+      </w:r>
     </w:p>
     <w:p>
       <w:pPr>
@@ -589,8 +617,22 @@
           <w:szCs w:val="24"/>
           <w:u w:val="single"/>
         </w:rPr>
+        <w:lastRenderedPageBreak/>
         <w:t>PETICIONES</w:t>
       </w:r>
+    </w:p>
+    <w:p>
+      <w:pPr>
+        <w:jc w:val="center"/>
+        <w:rPr>
+          <w:rFonts w:ascii="Arial" w:hAnsi="Arial" w:cs="Arial"/>
+          <w:b/>
+          <w:bCs/>
+          <w:sz w:val="24"/>
+          <w:szCs w:val="24"/>
+          <w:u w:val="single"/>
+        </w:rPr>
+      </w:pPr>
     </w:p>
     <w:p>
       <w:pPr>
@@ -612,82 +654,15 @@
           <w:sz w:val="24"/>
           <w:szCs w:val="24"/>
         </w:rPr>
-        <w:t xml:space="preserve">Se revoque </w:t>
-      </w:r>
-      <w:r>
-        <w:rPr>
-          <w:rFonts w:ascii="Arial" w:hAnsi="Arial" w:cs="Arial"/>
-          <w:color w:val="FF0000"/>
-          <w:sz w:val="24"/>
-          <w:szCs w:val="24"/>
-        </w:rPr>
-        <w:t>total/parcialmente</w:t>
-      </w:r>
-      <w:r>
-        <w:rPr>
-          <w:rFonts w:ascii="Arial" w:hAnsi="Arial" w:cs="Arial"/>
-          <w:sz w:val="24"/>
-          <w:szCs w:val="24"/>
-        </w:rPr>
-        <w:t xml:space="preserve"> </w:t>
-      </w:r>
-      <w:r>
-        <w:rPr>
-          <w:rFonts w:ascii="Arial" w:hAnsi="Arial" w:cs="Arial"/>
-          <w:color w:val="0F9ED5" w:themeColor="accent4"/>
-          <w:sz w:val="24"/>
-          <w:szCs w:val="24"/>
-        </w:rPr>
-        <w:t>(seleccionar en qué sentido quiere que se modifique el impuesto)</w:t>
-      </w:r>
-      <w:r>
-        <w:rPr>
-          <w:rFonts w:ascii="Arial" w:hAnsi="Arial" w:cs="Arial"/>
-          <w:sz w:val="24"/>
-          <w:szCs w:val="24"/>
-        </w:rPr>
-        <w:t xml:space="preserve"> </w:t>
-      </w:r>
-      <w:r>
-        <w:rPr>
-          <w:rFonts w:ascii="Arial" w:hAnsi="Arial" w:cs="Arial"/>
-          <w:sz w:val="24"/>
-          <w:szCs w:val="24"/>
-        </w:rPr>
-        <w:t xml:space="preserve">el impuesto </w:t>
-      </w:r>
-      <w:r>
-        <w:rPr>
-          <w:rFonts w:ascii="Arial" w:hAnsi="Arial" w:cs="Arial"/>
-          <w:sz w:val="24"/>
-          <w:szCs w:val="24"/>
-        </w:rPr>
-        <w:t>predial de la vigencia 202</w:t>
-      </w:r>
-      <w:r>
-        <w:rPr>
-          <w:rFonts w:ascii="Arial" w:hAnsi="Arial" w:cs="Arial"/>
-          <w:color w:val="FF0000"/>
-          <w:sz w:val="24"/>
-          <w:szCs w:val="24"/>
-        </w:rPr>
-        <w:t>X</w:t>
-      </w:r>
-      <w:r>
-        <w:rPr>
-          <w:rFonts w:ascii="Arial" w:hAnsi="Arial" w:cs="Arial"/>
-          <w:sz w:val="24"/>
-          <w:szCs w:val="24"/>
-        </w:rPr>
-        <w:t xml:space="preserve"> de la refe</w:t>
-      </w:r>
-      <w:r>
-        <w:rPr>
-          <w:rFonts w:ascii="Arial" w:hAnsi="Arial" w:cs="Arial"/>
-          <w:sz w:val="24"/>
-          <w:szCs w:val="24"/>
-        </w:rPr>
-        <w:t>rencia</w:t>
+        <w:t>Se revoque el impue</w:t>
+      </w:r>
+      <w:r>
+        <w:rPr>
+          <w:rFonts w:ascii="Arial" w:hAnsi="Arial" w:cs="Arial"/>
+          <w:sz w:val="24"/>
+          <w:szCs w:val="24"/>
+        </w:rPr>
+        <w:t>sto predial de la vigencia 2026 de la referencia</w:t>
       </w:r>
       <w:r>
         <w:rPr>
@@ -733,64 +708,18 @@
       <w:r>
         <w:rPr>
           <w:rFonts w:ascii="Arial" w:hAnsi="Arial" w:cs="Arial"/>
-          <w:color w:val="FF0000"/>
-          <w:sz w:val="24"/>
-          <w:szCs w:val="24"/>
-        </w:rPr>
-        <w:t xml:space="preserve">reliquide el valor del impuesto, se corrija el área </w:t>
-      </w:r>
-      <w:r>
-        <w:rPr>
-          <w:rFonts w:ascii="Arial" w:hAnsi="Arial" w:cs="Arial"/>
-          <w:color w:val="FF0000"/>
-          <w:sz w:val="24"/>
-          <w:szCs w:val="24"/>
-        </w:rPr>
-        <w:t xml:space="preserve">del inmueble </w:t>
-      </w:r>
-      <w:r>
-        <w:rPr>
-          <w:rFonts w:ascii="Arial" w:hAnsi="Arial" w:cs="Arial"/>
-          <w:color w:val="FF0000"/>
-          <w:sz w:val="24"/>
-          <w:szCs w:val="24"/>
-        </w:rPr>
-        <w:t>señalada en el impuesto</w:t>
-      </w:r>
-      <w:r>
-        <w:rPr>
-          <w:rFonts w:ascii="Arial" w:hAnsi="Arial" w:cs="Arial"/>
-          <w:color w:val="FF0000"/>
-          <w:sz w:val="24"/>
-          <w:szCs w:val="24"/>
-        </w:rPr>
-        <w:t>, se recalcule el avalúo catastral</w:t>
-      </w:r>
-      <w:r>
-        <w:rPr>
-          <w:rFonts w:ascii="Arial" w:hAnsi="Arial" w:cs="Arial"/>
-          <w:color w:val="FF0000"/>
-          <w:sz w:val="24"/>
-          <w:szCs w:val="24"/>
-        </w:rPr>
-        <w:t xml:space="preserve"> </w:t>
-      </w:r>
-      <w:r>
-        <w:rPr>
-          <w:rFonts w:ascii="Arial" w:hAnsi="Arial" w:cs="Arial"/>
-          <w:color w:val="0F9ED5" w:themeColor="accent4"/>
-          <w:sz w:val="24"/>
-          <w:szCs w:val="24"/>
-        </w:rPr>
-        <w:t>(escoger o añadir cual es propósito del recurso)</w:t>
-      </w:r>
-      <w:r>
-        <w:rPr>
-          <w:rFonts w:ascii="Arial" w:hAnsi="Arial" w:cs="Arial"/>
-          <w:sz w:val="24"/>
-          <w:szCs w:val="24"/>
-        </w:rPr>
-        <w:t xml:space="preserve">. </w:t>
+          <w:sz w:val="24"/>
+          <w:szCs w:val="24"/>
+        </w:rPr>
+        <w:t>reliquide el valor del impuesto, realizando las correcciones pertinentes sobre</w:t>
+      </w:r>
+      <w:r>
+        <w:rPr>
+          <w:rFonts w:ascii="Arial" w:hAnsi="Arial" w:cs="Arial"/>
+          <w:sz w:val="24"/>
+          <w:szCs w:val="24"/>
+        </w:rPr>
+        <w:t xml:space="preserve"> la liquidación del impuesto de acuerdo con lo manifestado en el acápite de hechos y teniendo en cuenta la realidad actual del inmueble en materia física, económica y jurídica. </w:t>
       </w:r>
     </w:p>
     <w:p>
@@ -823,7 +752,6 @@
           <w:sz w:val="24"/>
           <w:szCs w:val="24"/>
         </w:rPr>
-        <w:lastRenderedPageBreak/>
         <w:t xml:space="preserve">Se suspenda toda acción de cobro, así como el cálculo de intereses moratorios, hasta que resuelva el presente recurso, dándose así en efecto suspensivo. </w:t>
       </w:r>
     </w:p>
@@ -864,6 +792,39 @@
     <w:p>
       <w:pPr>
         <w:pStyle w:val="Prrafodelista"/>
+        <w:rPr>
+          <w:rFonts w:ascii="Arial" w:hAnsi="Arial" w:cs="Arial"/>
+          <w:sz w:val="24"/>
+          <w:szCs w:val="24"/>
+        </w:rPr>
+      </w:pPr>
+    </w:p>
+    <w:p>
+      <w:pPr>
+        <w:pStyle w:val="Prrafodelista"/>
+        <w:numPr>
+          <w:ilvl w:val="0"/>
+          <w:numId w:val="1"/>
+        </w:numPr>
+        <w:jc w:val="both"/>
+        <w:rPr>
+          <w:rFonts w:ascii="Arial" w:hAnsi="Arial" w:cs="Arial"/>
+          <w:sz w:val="24"/>
+          <w:szCs w:val="24"/>
+        </w:rPr>
+      </w:pPr>
+      <w:r>
+        <w:rPr>
+          <w:rFonts w:ascii="Arial" w:hAnsi="Arial" w:cs="Arial"/>
+          <w:sz w:val="24"/>
+          <w:szCs w:val="24"/>
+        </w:rPr>
+        <w:t>Una vez se responda el presente recurso se mantenga el beneficio por pronto pago en la misma cantidad de tiempo y porcentajes definidos inicialmente.</w:t>
+      </w:r>
+    </w:p>
+    <w:p>
+      <w:pPr>
+        <w:pStyle w:val="Prrafodelista"/>
         <w:jc w:val="both"/>
         <w:rPr>
           <w:rFonts w:ascii="Arial" w:hAnsi="Arial" w:cs="Arial"/>
@@ -960,13 +921,20 @@
     </w:p>
     <w:p>
       <w:pPr>
-        <w:spacing w:after="0"/>
-        <w:rPr>
-          <w:rFonts w:ascii="Arial" w:hAnsi="Arial" w:cs="Arial"/>
-          <w:sz w:val="24"/>
-          <w:szCs w:val="24"/>
-        </w:rPr>
-      </w:pPr>
+        <w:rPr>
+          <w:rFonts w:ascii="Arial" w:hAnsi="Arial" w:cs="Arial"/>
+          <w:sz w:val="24"/>
+          <w:szCs w:val="24"/>
+        </w:rPr>
+      </w:pPr>
+      <w:r>
+        <w:rPr>
+          <w:rFonts w:ascii="Arial" w:hAnsi="Arial" w:cs="Arial"/>
+          <w:sz w:val="24"/>
+          <w:szCs w:val="24"/>
+        </w:rPr>
+        <w:br w:type="page"/>
+      </w:r>
     </w:p>
     <w:p>
       <w:pPr>
@@ -990,6 +958,7 @@
           <w:szCs w:val="24"/>
           <w:u w:val="single"/>
         </w:rPr>
+        <w:lastRenderedPageBreak/>
         <w:t>NOTIFICACIONES</w:t>
       </w:r>
     </w:p>
@@ -1238,22 +1207,12 @@
         <w:t>Celular_Solicitante</w:t>
       </w:r>
       <w:proofErr w:type="spellEnd"/>
-    </w:p>
-    <w:p>
-      <w:pPr>
-        <w:spacing w:after="0"/>
-        <w:rPr>
-          <w:rFonts w:ascii="Arial" w:hAnsi="Arial" w:cs="Arial"/>
-          <w:sz w:val="24"/>
-          <w:szCs w:val="24"/>
-        </w:rPr>
-      </w:pPr>
     </w:p>
     <w:sectPr>
       <w:headerReference w:type="default" r:id="rId8"/>
       <w:footerReference w:type="default" r:id="rId9"/>
       <w:pgSz w:w="12240" w:h="15840"/>
-      <w:pgMar w:top="1417" w:right="1701" w:bottom="1417" w:left="1701" w:header="708" w:footer="708" w:gutter="0"/>
+      <w:pgMar w:top="2268" w:right="1701" w:bottom="1701" w:left="1701" w:header="709" w:footer="709" w:gutter="0"/>
       <w:cols w:space="708"/>
       <w:docGrid w:linePitch="360"/>
     </w:sectPr>
@@ -1262,7 +1221,7 @@
 </file>
 
 <file path=word/endnotes.xml><?xml version="1.0" encoding="utf-8"?>
-<w:endnotes xmlns:wpc="http://schemas.microsoft.com/office/word/2010/wordprocessingCanvas" xmlns:cx="http://schemas.microsoft.com/office/drawing/2014/chartex" xmlns:cx1="http://schemas.microsoft.com/office/drawing/2015/9/8/chartex" xmlns:cx2="http://schemas.microsoft.com/office/drawing/2015/10/21/chartex" xmlns:cx3="http://schemas.microsoft.com/office/drawing/2016/5/9/chartex" xmlns:cx4="http://schemas.microsoft.com/office/drawing/2016/5/10/chartex" xmlns:cx5="http://schemas.microsoft.com/office/drawing/2016/5/11/chartex" xmlns:cx6="http://schemas.microsoft.com/office/drawing/2016/5/12/chartex" xmlns:cx7="http://schemas.microsoft.com/office/drawing/2016/5/13/chartex" xmlns:cx8="http://schemas.microsoft.com/office/drawing/2016/5/14/chartex" xmlns:mc="http://schemas.openxmlformats.org/markup-compatibility/2006" xmlns:aink="http://schemas.microsoft.com/office/drawing/2016/ink" xmlns:am3d="http://schemas.microsoft.com/office/drawing/2017/model3d" xmlns:o="urn:schemas-microsoft-com:office:office" xmlns:oel="http://schemas.microsoft.com/office/2019/extlst" xmlns:r="http://schemas.openxmlformats.org/officeDocument/2006/relationships" xmlns:m="http://schemas.openxmlformats.org/officeDocument/2006/math" xmlns:v="urn:schemas-microsoft-com:vml" xmlns:wp14="http://schemas.microsoft.com/office/word/2010/wordprocessingDrawing" xmlns:wp="http://schemas.openxmlformats.org/drawingml/2006/wordprocessingDrawing" xmlns:w10="urn:schemas-microsoft-com:office:word" xmlns:w="http://schemas.openxmlformats.org/wordprocessingml/2006/main" xmlns:w14="http://schemas.microsoft.com/office/word/2010/wordml" xmlns:w15="http://schemas.microsoft.com/office/word/2012/wordml" xmlns:w16cex="http://schemas.microsoft.com/office/word/2018/wordml/cex" xmlns:w16cid="http://schemas.microsoft.com/office/word/2016/wordml/cid" xmlns:w16="http://schemas.microsoft.com/office/word/2018/wordml" xmlns:w16du="http://schemas.microsoft.com/office/word/2023/wordml/word16du" xmlns:w16sdtdh="http://schemas.microsoft.com/office/word/2020/wordml/sdtdatahash" xmlns:w16sdtfl="http://schemas.microsoft.com/office/word/2024/wordml/sdtformatlock" xmlns:w16se="http://schemas.microsoft.com/office/word/2015/wordml/symex" xmlns:wpg="http://schemas.microsoft.com/office/word/2010/wordprocessingGroup" xmlns:wpi="http://schemas.microsoft.com/office/word/2010/wordprocessingInk" xmlns:wne="http://schemas.microsoft.com/office/word/2006/wordml" xmlns:wps="http://schemas.microsoft.com/office/word/2010/wordprocessingShape" mc:Ignorable="w14 w15 w16se w16cid w16 w16cex w16sdtdh w16sdtfl w16du wp14">
+<w:endnotes xmlns:wpc="http://schemas.microsoft.com/office/word/2010/wordprocessingCanvas" xmlns:cx="http://schemas.microsoft.com/office/drawing/2014/chartex" xmlns:cx1="http://schemas.microsoft.com/office/drawing/2015/9/8/chartex" xmlns:cx2="http://schemas.microsoft.com/office/drawing/2015/10/21/chartex" xmlns:cx3="http://schemas.microsoft.com/office/drawing/2016/5/9/chartex" xmlns:cx4="http://schemas.microsoft.com/office/drawing/2016/5/10/chartex" xmlns:cx5="http://schemas.microsoft.com/office/drawing/2016/5/11/chartex" xmlns:cx6="http://schemas.microsoft.com/office/drawing/2016/5/12/chartex" xmlns:cx7="http://schemas.microsoft.com/office/drawing/2016/5/13/chartex" xmlns:cx8="http://schemas.microsoft.com/office/drawing/2016/5/14/chartex" xmlns:mc="http://schemas.openxmlformats.org/markup-compatibility/2006" xmlns:aink="http://schemas.microsoft.com/office/drawing/2016/ink" xmlns:am3d="http://schemas.microsoft.com/office/drawing/2017/model3d" xmlns:o="urn:schemas-microsoft-com:office:office" xmlns:oel="http://schemas.microsoft.com/office/2019/extlst" xmlns:r="http://schemas.openxmlformats.org/officeDocument/2006/relationships" xmlns:m="http://schemas.openxmlformats.org/officeDocument/2006/math" xmlns:v="urn:schemas-microsoft-com:vml" xmlns:wp14="http://schemas.microsoft.com/office/word/2010/wordprocessingDrawing" xmlns:wp="http://schemas.openxmlformats.org/drawingml/2006/wordprocessingDrawing" xmlns:w10="urn:schemas-microsoft-com:office:word" xmlns:w="http://schemas.openxmlformats.org/wordprocessingml/2006/main" xmlns:w14="http://schemas.microsoft.com/office/word/2010/wordml" xmlns:w15="http://schemas.microsoft.com/office/word/2012/wordml" xmlns:w16cei="http://schemas.microsoft.com/office/word/2026/wordml/cei" xmlns:w16cex="http://schemas.microsoft.com/office/word/2018/wordml/cex" xmlns:w16cid="http://schemas.microsoft.com/office/word/2016/wordml/cid" xmlns:w16="http://schemas.microsoft.com/office/word/2018/wordml" xmlns:w16du="http://schemas.microsoft.com/office/word/2023/wordml/word16du" xmlns:w16sdtdh="http://schemas.microsoft.com/office/word/2020/wordml/sdtdatahash" xmlns:w16sdtfl="http://schemas.microsoft.com/office/word/2024/wordml/sdtformatlock" xmlns:w16se="http://schemas.microsoft.com/office/word/2015/wordml/symex" xmlns:wpg="http://schemas.microsoft.com/office/word/2010/wordprocessingGroup" xmlns:wpi="http://schemas.microsoft.com/office/word/2010/wordprocessingInk" xmlns:wne="http://schemas.microsoft.com/office/word/2006/wordml" xmlns:wps="http://schemas.microsoft.com/office/word/2010/wordprocessingShape" mc:Ignorable="w14 w15 w16se w16cid w16 w16cex w16sdtdh w16sdtfl w16du wp14">
   <w:endnote w:type="separator" w:id="-1">
     <w:p>
       <w:pPr>
@@ -1287,7 +1246,7 @@
 </file>
 
 <file path=word/footer1.xml><?xml version="1.0" encoding="utf-8"?>
-<w:ftr xmlns:wpc="http://schemas.microsoft.com/office/word/2010/wordprocessingCanvas" xmlns:cx="http://schemas.microsoft.com/office/drawing/2014/chartex" xmlns:cx1="http://schemas.microsoft.com/office/drawing/2015/9/8/chartex" xmlns:cx2="http://schemas.microsoft.com/office/drawing/2015/10/21/chartex" xmlns:cx3="http://schemas.microsoft.com/office/drawing/2016/5/9/chartex" xmlns:cx4="http://schemas.microsoft.com/office/drawing/2016/5/10/chartex" xmlns:cx5="http://schemas.microsoft.com/office/drawing/2016/5/11/chartex" xmlns:cx6="http://schemas.microsoft.com/office/drawing/2016/5/12/chartex" xmlns:cx7="http://schemas.microsoft.com/office/drawing/2016/5/13/chartex" xmlns:cx8="http://schemas.microsoft.com/office/drawing/2016/5/14/chartex" xmlns:mc="http://schemas.openxmlformats.org/markup-compatibility/2006" xmlns:aink="http://schemas.microsoft.com/office/drawing/2016/ink" xmlns:am3d="http://schemas.microsoft.com/office/drawing/2017/model3d" xmlns:o="urn:schemas-microsoft-com:office:office" xmlns:oel="http://schemas.microsoft.com/office/2019/extlst" xmlns:r="http://schemas.openxmlformats.org/officeDocument/2006/relationships" xmlns:m="http://schemas.openxmlformats.org/officeDocument/2006/math" xmlns:v="urn:schemas-microsoft-com:vml" xmlns:wp14="http://schemas.microsoft.com/office/word/2010/wordprocessingDrawing" xmlns:wp="http://schemas.openxmlformats.org/drawingml/2006/wordprocessingDrawing" xmlns:w10="urn:schemas-microsoft-com:office:word" xmlns:w="http://schemas.openxmlformats.org/wordprocessingml/2006/main" xmlns:w14="http://schemas.microsoft.com/office/word/2010/wordml" xmlns:w15="http://schemas.microsoft.com/office/word/2012/wordml" xmlns:w16cex="http://schemas.microsoft.com/office/word/2018/wordml/cex" xmlns:w16cid="http://schemas.microsoft.com/office/word/2016/wordml/cid" xmlns:w16="http://schemas.microsoft.com/office/word/2018/wordml" xmlns:w16du="http://schemas.microsoft.com/office/word/2023/wordml/word16du" xmlns:w16sdtdh="http://schemas.microsoft.com/office/word/2020/wordml/sdtdatahash" xmlns:w16sdtfl="http://schemas.microsoft.com/office/word/2024/wordml/sdtformatlock" xmlns:w16se="http://schemas.microsoft.com/office/word/2015/wordml/symex" xmlns:wpg="http://schemas.microsoft.com/office/word/2010/wordprocessingGroup" xmlns:wpi="http://schemas.microsoft.com/office/word/2010/wordprocessingInk" xmlns:wne="http://schemas.microsoft.com/office/word/2006/wordml" xmlns:wps="http://schemas.microsoft.com/office/word/2010/wordprocessingShape" mc:Ignorable="w14 w15 w16se w16cid w16 w16cex w16sdtdh w16sdtfl w16du wp14">
+<w:ftr xmlns:wpc="http://schemas.microsoft.com/office/word/2010/wordprocessingCanvas" xmlns:cx="http://schemas.microsoft.com/office/drawing/2014/chartex" xmlns:cx1="http://schemas.microsoft.com/office/drawing/2015/9/8/chartex" xmlns:cx2="http://schemas.microsoft.com/office/drawing/2015/10/21/chartex" xmlns:cx3="http://schemas.microsoft.com/office/drawing/2016/5/9/chartex" xmlns:cx4="http://schemas.microsoft.com/office/drawing/2016/5/10/chartex" xmlns:cx5="http://schemas.microsoft.com/office/drawing/2016/5/11/chartex" xmlns:cx6="http://schemas.microsoft.com/office/drawing/2016/5/12/chartex" xmlns:cx7="http://schemas.microsoft.com/office/drawing/2016/5/13/chartex" xmlns:cx8="http://schemas.microsoft.com/office/drawing/2016/5/14/chartex" xmlns:mc="http://schemas.openxmlformats.org/markup-compatibility/2006" xmlns:aink="http://schemas.microsoft.com/office/drawing/2016/ink" xmlns:am3d="http://schemas.microsoft.com/office/drawing/2017/model3d" xmlns:o="urn:schemas-microsoft-com:office:office" xmlns:oel="http://schemas.microsoft.com/office/2019/extlst" xmlns:r="http://schemas.openxmlformats.org/officeDocument/2006/relationships" xmlns:m="http://schemas.openxmlformats.org/officeDocument/2006/math" xmlns:v="urn:schemas-microsoft-com:vml" xmlns:wp14="http://schemas.microsoft.com/office/word/2010/wordprocessingDrawing" xmlns:wp="http://schemas.openxmlformats.org/drawingml/2006/wordprocessingDrawing" xmlns:w10="urn:schemas-microsoft-com:office:word" xmlns:w="http://schemas.openxmlformats.org/wordprocessingml/2006/main" xmlns:w14="http://schemas.microsoft.com/office/word/2010/wordml" xmlns:w15="http://schemas.microsoft.com/office/word/2012/wordml" xmlns:w16cei="http://schemas.microsoft.com/office/word/2026/wordml/cei" xmlns:w16cex="http://schemas.microsoft.com/office/word/2018/wordml/cex" xmlns:w16cid="http://schemas.microsoft.com/office/word/2016/wordml/cid" xmlns:w16="http://schemas.microsoft.com/office/word/2018/wordml" xmlns:w16du="http://schemas.microsoft.com/office/word/2023/wordml/word16du" xmlns:w16sdtdh="http://schemas.microsoft.com/office/word/2020/wordml/sdtdatahash" xmlns:w16sdtfl="http://schemas.microsoft.com/office/word/2024/wordml/sdtformatlock" xmlns:w16se="http://schemas.microsoft.com/office/word/2015/wordml/symex" xmlns:wpg="http://schemas.microsoft.com/office/word/2010/wordprocessingGroup" xmlns:wpi="http://schemas.microsoft.com/office/word/2010/wordprocessingInk" xmlns:wne="http://schemas.microsoft.com/office/word/2006/wordml" xmlns:wps="http://schemas.microsoft.com/office/word/2010/wordprocessingShape" mc:Ignorable="w14 w15 w16se w16cid w16 w16cex w16sdtdh w16sdtfl w16du wp14">
   <w:p>
     <w:pPr>
       <w:pStyle w:val="Piedepgina"/>
@@ -1341,7 +1300,7 @@
 </file>
 
 <file path=word/footnotes.xml><?xml version="1.0" encoding="utf-8"?>
-<w:footnotes xmlns:wpc="http://schemas.microsoft.com/office/word/2010/wordprocessingCanvas" xmlns:cx="http://schemas.microsoft.com/office/drawing/2014/chartex" xmlns:cx1="http://schemas.microsoft.com/office/drawing/2015/9/8/chartex" xmlns:cx2="http://schemas.microsoft.com/office/drawing/2015/10/21/chartex" xmlns:cx3="http://schemas.microsoft.com/office/drawing/2016/5/9/chartex" xmlns:cx4="http://schemas.microsoft.com/office/drawing/2016/5/10/chartex" xmlns:cx5="http://schemas.microsoft.com/office/drawing/2016/5/11/chartex" xmlns:cx6="http://schemas.microsoft.com/office/drawing/2016/5/12/chartex" xmlns:cx7="http://schemas.microsoft.com/office/drawing/2016/5/13/chartex" xmlns:cx8="http://schemas.microsoft.com/office/drawing/2016/5/14/chartex" xmlns:mc="http://schemas.openxmlformats.org/markup-compatibility/2006" xmlns:aink="http://schemas.microsoft.com/office/drawing/2016/ink" xmlns:am3d="http://schemas.microsoft.com/office/drawing/2017/model3d" xmlns:o="urn:schemas-microsoft-com:office:office" xmlns:oel="http://schemas.microsoft.com/office/2019/extlst" xmlns:r="http://schemas.openxmlformats.org/officeDocument/2006/relationships" xmlns:m="http://schemas.openxmlformats.org/officeDocument/2006/math" xmlns:v="urn:schemas-microsoft-com:vml" xmlns:wp14="http://schemas.microsoft.com/office/word/2010/wordprocessingDrawing" xmlns:wp="http://schemas.openxmlformats.org/drawingml/2006/wordprocessingDrawing" xmlns:w10="urn:schemas-microsoft-com:office:word" xmlns:w="http://schemas.openxmlformats.org/wordprocessingml/2006/main" xmlns:w14="http://schemas.microsoft.com/office/word/2010/wordml" xmlns:w15="http://schemas.microsoft.com/office/word/2012/wordml" xmlns:w16cex="http://schemas.microsoft.com/office/word/2018/wordml/cex" xmlns:w16cid="http://schemas.microsoft.com/office/word/2016/wordml/cid" xmlns:w16="http://schemas.microsoft.com/office/word/2018/wordml" xmlns:w16du="http://schemas.microsoft.com/office/word/2023/wordml/word16du" xmlns:w16sdtdh="http://schemas.microsoft.com/office/word/2020/wordml/sdtdatahash" xmlns:w16sdtfl="http://schemas.microsoft.com/office/word/2024/wordml/sdtformatlock" xmlns:w16se="http://schemas.microsoft.com/office/word/2015/wordml/symex" xmlns:wpg="http://schemas.microsoft.com/office/word/2010/wordprocessingGroup" xmlns:wpi="http://schemas.microsoft.com/office/word/2010/wordprocessingInk" xmlns:wne="http://schemas.microsoft.com/office/word/2006/wordml" xmlns:wps="http://schemas.microsoft.com/office/word/2010/wordprocessingShape" mc:Ignorable="w14 w15 w16se w16cid w16 w16cex w16sdtdh w16sdtfl w16du wp14">
+<w:footnotes xmlns:wpc="http://schemas.microsoft.com/office/word/2010/wordprocessingCanvas" xmlns:cx="http://schemas.microsoft.com/office/drawing/2014/chartex" xmlns:cx1="http://schemas.microsoft.com/office/drawing/2015/9/8/chartex" xmlns:cx2="http://schemas.microsoft.com/office/drawing/2015/10/21/chartex" xmlns:cx3="http://schemas.microsoft.com/office/drawing/2016/5/9/chartex" xmlns:cx4="http://schemas.microsoft.com/office/drawing/2016/5/10/chartex" xmlns:cx5="http://schemas.microsoft.com/office/drawing/2016/5/11/chartex" xmlns:cx6="http://schemas.microsoft.com/office/drawing/2016/5/12/chartex" xmlns:cx7="http://schemas.microsoft.com/office/drawing/2016/5/13/chartex" xmlns:cx8="http://schemas.microsoft.com/office/drawing/2016/5/14/chartex" xmlns:mc="http://schemas.openxmlformats.org/markup-compatibility/2006" xmlns:aink="http://schemas.microsoft.com/office/drawing/2016/ink" xmlns:am3d="http://schemas.microsoft.com/office/drawing/2017/model3d" xmlns:o="urn:schemas-microsoft-com:office:office" xmlns:oel="http://schemas.microsoft.com/office/2019/extlst" xmlns:r="http://schemas.openxmlformats.org/officeDocument/2006/relationships" xmlns:m="http://schemas.openxmlformats.org/officeDocument/2006/math" xmlns:v="urn:schemas-microsoft-com:vml" xmlns:wp14="http://schemas.microsoft.com/office/word/2010/wordprocessingDrawing" xmlns:wp="http://schemas.openxmlformats.org/drawingml/2006/wordprocessingDrawing" xmlns:w10="urn:schemas-microsoft-com:office:word" xmlns:w="http://schemas.openxmlformats.org/wordprocessingml/2006/main" xmlns:w14="http://schemas.microsoft.com/office/word/2010/wordml" xmlns:w15="http://schemas.microsoft.com/office/word/2012/wordml" xmlns:w16cei="http://schemas.microsoft.com/office/word/2026/wordml/cei" xmlns:w16cex="http://schemas.microsoft.com/office/word/2018/wordml/cex" xmlns:w16cid="http://schemas.microsoft.com/office/word/2016/wordml/cid" xmlns:w16="http://schemas.microsoft.com/office/word/2018/wordml" xmlns:w16du="http://schemas.microsoft.com/office/word/2023/wordml/word16du" xmlns:w16sdtdh="http://schemas.microsoft.com/office/word/2020/wordml/sdtdatahash" xmlns:w16sdtfl="http://schemas.microsoft.com/office/word/2024/wordml/sdtformatlock" xmlns:w16se="http://schemas.microsoft.com/office/word/2015/wordml/symex" xmlns:wpg="http://schemas.microsoft.com/office/word/2010/wordprocessingGroup" xmlns:wpi="http://schemas.microsoft.com/office/word/2010/wordprocessingInk" xmlns:wne="http://schemas.microsoft.com/office/word/2006/wordml" xmlns:wps="http://schemas.microsoft.com/office/word/2010/wordprocessingShape" mc:Ignorable="w14 w15 w16se w16cid w16 w16cex w16sdtdh w16sdtfl w16du wp14">
   <w:footnote w:type="separator" w:id="-1">
     <w:p>
       <w:pPr>
@@ -1366,7 +1325,7 @@
 </file>
 
 <file path=word/header1.xml><?xml version="1.0" encoding="utf-8"?>
-<w:hdr xmlns:wpc="http://schemas.microsoft.com/office/word/2010/wordprocessingCanvas" xmlns:cx="http://schemas.microsoft.com/office/drawing/2014/chartex" xmlns:cx1="http://schemas.microsoft.com/office/drawing/2015/9/8/chartex" xmlns:cx2="http://schemas.microsoft.com/office/drawing/2015/10/21/chartex" xmlns:cx3="http://schemas.microsoft.com/office/drawing/2016/5/9/chartex" xmlns:cx4="http://schemas.microsoft.com/office/drawing/2016/5/10/chartex" xmlns:cx5="http://schemas.microsoft.com/office/drawing/2016/5/11/chartex" xmlns:cx6="http://schemas.microsoft.com/office/drawing/2016/5/12/chartex" xmlns:cx7="http://schemas.microsoft.com/office/drawing/2016/5/13/chartex" xmlns:cx8="http://schemas.microsoft.com/office/drawing/2016/5/14/chartex" xmlns:mc="http://schemas.openxmlformats.org/markup-compatibility/2006" xmlns:aink="http://schemas.microsoft.com/office/drawing/2016/ink" xmlns:am3d="http://schemas.microsoft.com/office/drawing/2017/model3d" xmlns:o="urn:schemas-microsoft-com:office:office" xmlns:oel="http://schemas.microsoft.com/office/2019/extlst" xmlns:r="http://schemas.openxmlformats.org/officeDocument/2006/relationships" xmlns:m="http://schemas.openxmlformats.org/officeDocument/2006/math" xmlns:v="urn:schemas-microsoft-com:vml" xmlns:wp14="http://schemas.microsoft.com/office/word/2010/wordprocessingDrawing" xmlns:wp="http://schemas.openxmlformats.org/drawingml/2006/wordprocessingDrawing" xmlns:w10="urn:schemas-microsoft-com:office:word" xmlns:w="http://schemas.openxmlformats.org/wordprocessingml/2006/main" xmlns:w14="http://schemas.microsoft.com/office/word/2010/wordml" xmlns:w15="http://schemas.microsoft.com/office/word/2012/wordml" xmlns:w16cex="http://schemas.microsoft.com/office/word/2018/wordml/cex" xmlns:w16cid="http://schemas.microsoft.com/office/word/2016/wordml/cid" xmlns:w16="http://schemas.microsoft.com/office/word/2018/wordml" xmlns:w16du="http://schemas.microsoft.com/office/word/2023/wordml/word16du" xmlns:w16sdtdh="http://schemas.microsoft.com/office/word/2020/wordml/sdtdatahash" xmlns:w16sdtfl="http://schemas.microsoft.com/office/word/2024/wordml/sdtformatlock" xmlns:w16se="http://schemas.microsoft.com/office/word/2015/wordml/symex" xmlns:wpg="http://schemas.microsoft.com/office/word/2010/wordprocessingGroup" xmlns:wpi="http://schemas.microsoft.com/office/word/2010/wordprocessingInk" xmlns:wne="http://schemas.microsoft.com/office/word/2006/wordml" xmlns:wps="http://schemas.microsoft.com/office/word/2010/wordprocessingShape" mc:Ignorable="w14 w15 w16se w16cid w16 w16cex w16sdtdh w16sdtfl w16du wp14">
+<w:hdr xmlns:wpc="http://schemas.microsoft.com/office/word/2010/wordprocessingCanvas" xmlns:cx="http://schemas.microsoft.com/office/drawing/2014/chartex" xmlns:cx1="http://schemas.microsoft.com/office/drawing/2015/9/8/chartex" xmlns:cx2="http://schemas.microsoft.com/office/drawing/2015/10/21/chartex" xmlns:cx3="http://schemas.microsoft.com/office/drawing/2016/5/9/chartex" xmlns:cx4="http://schemas.microsoft.com/office/drawing/2016/5/10/chartex" xmlns:cx5="http://schemas.microsoft.com/office/drawing/2016/5/11/chartex" xmlns:cx6="http://schemas.microsoft.com/office/drawing/2016/5/12/chartex" xmlns:cx7="http://schemas.microsoft.com/office/drawing/2016/5/13/chartex" xmlns:cx8="http://schemas.microsoft.com/office/drawing/2016/5/14/chartex" xmlns:mc="http://schemas.openxmlformats.org/markup-compatibility/2006" xmlns:aink="http://schemas.microsoft.com/office/drawing/2016/ink" xmlns:am3d="http://schemas.microsoft.com/office/drawing/2017/model3d" xmlns:o="urn:schemas-microsoft-com:office:office" xmlns:oel="http://schemas.microsoft.com/office/2019/extlst" xmlns:r="http://schemas.openxmlformats.org/officeDocument/2006/relationships" xmlns:m="http://schemas.openxmlformats.org/officeDocument/2006/math" xmlns:v="urn:schemas-microsoft-com:vml" xmlns:wp14="http://schemas.microsoft.com/office/word/2010/wordprocessingDrawing" xmlns:wp="http://schemas.openxmlformats.org/drawingml/2006/wordprocessingDrawing" xmlns:w10="urn:schemas-microsoft-com:office:word" xmlns:w="http://schemas.openxmlformats.org/wordprocessingml/2006/main" xmlns:w14="http://schemas.microsoft.com/office/word/2010/wordml" xmlns:w15="http://schemas.microsoft.com/office/word/2012/wordml" xmlns:w16cei="http://schemas.microsoft.com/office/word/2026/wordml/cei" xmlns:w16cex="http://schemas.microsoft.com/office/word/2018/wordml/cex" xmlns:w16cid="http://schemas.microsoft.com/office/word/2016/wordml/cid" xmlns:w16="http://schemas.microsoft.com/office/word/2018/wordml" xmlns:w16du="http://schemas.microsoft.com/office/word/2023/wordml/word16du" xmlns:w16sdtdh="http://schemas.microsoft.com/office/word/2020/wordml/sdtdatahash" xmlns:w16sdtfl="http://schemas.microsoft.com/office/word/2024/wordml/sdtformatlock" xmlns:w16se="http://schemas.microsoft.com/office/word/2015/wordml/symex" xmlns:wpg="http://schemas.microsoft.com/office/word/2010/wordprocessingGroup" xmlns:wpi="http://schemas.microsoft.com/office/word/2010/wordprocessingInk" xmlns:wne="http://schemas.microsoft.com/office/word/2006/wordml" xmlns:wps="http://schemas.microsoft.com/office/word/2010/wordprocessingShape" mc:Ignorable="w14 w15 w16se w16cid w16 w16cex w16sdtdh w16sdtfl w16du wp14">
   <w:p>
     <w:pPr>
       <w:pStyle w:val="Encabezado"/>
@@ -1393,7 +1352,7 @@
 </file>
 
 <file path=word/numbering.xml><?xml version="1.0" encoding="utf-8"?>
-<w:numbering xmlns:wpc="http://schemas.microsoft.com/office/word/2010/wordprocessingCanvas" xmlns:cx="http://schemas.microsoft.com/office/drawing/2014/chartex" xmlns:cx1="http://schemas.microsoft.com/office/drawing/2015/9/8/chartex" xmlns:cx2="http://schemas.microsoft.com/office/drawing/2015/10/21/chartex" xmlns:cx3="http://schemas.microsoft.com/office/drawing/2016/5/9/chartex" xmlns:cx4="http://schemas.microsoft.com/office/drawing/2016/5/10/chartex" xmlns:cx5="http://schemas.microsoft.com/office/drawing/2016/5/11/chartex" xmlns:cx6="http://schemas.microsoft.com/office/drawing/2016/5/12/chartex" xmlns:cx7="http://schemas.microsoft.com/office/drawing/2016/5/13/chartex" xmlns:cx8="http://schemas.microsoft.com/office/drawing/2016/5/14/chartex" xmlns:mc="http://schemas.openxmlformats.org/markup-compatibility/2006" xmlns:aink="http://schemas.microsoft.com/office/drawing/2016/ink" xmlns:am3d="http://schemas.microsoft.com/office/drawing/2017/model3d" xmlns:o="urn:schemas-microsoft-com:office:office" xmlns:oel="http://schemas.microsoft.com/office/2019/extlst" xmlns:r="http://schemas.openxmlformats.org/officeDocument/2006/relationships" xmlns:m="http://schemas.openxmlformats.org/officeDocument/2006/math" xmlns:v="urn:schemas-microsoft-com:vml" xmlns:wp14="http://schemas.microsoft.com/office/word/2010/wordprocessingDrawing" xmlns:wp="http://schemas.openxmlformats.org/drawingml/2006/wordprocessingDrawing" xmlns:w10="urn:schemas-microsoft-com:office:word" xmlns:w="http://schemas.openxmlformats.org/wordprocessingml/2006/main" xmlns:w14="http://schemas.microsoft.com/office/word/2010/wordml" xmlns:w15="http://schemas.microsoft.com/office/word/2012/wordml" xmlns:w16cex="http://schemas.microsoft.com/office/word/2018/wordml/cex" xmlns:w16cid="http://schemas.microsoft.com/office/word/2016/wordml/cid" xmlns:w16="http://schemas.microsoft.com/office/word/2018/wordml" xmlns:w16du="http://schemas.microsoft.com/office/word/2023/wordml/word16du" xmlns:w16sdtdh="http://schemas.microsoft.com/office/word/2020/wordml/sdtdatahash" xmlns:w16sdtfl="http://schemas.microsoft.com/office/word/2024/wordml/sdtformatlock" xmlns:w16se="http://schemas.microsoft.com/office/word/2015/wordml/symex" xmlns:wpg="http://schemas.microsoft.com/office/word/2010/wordprocessingGroup" xmlns:wpi="http://schemas.microsoft.com/office/word/2010/wordprocessingInk" xmlns:wne="http://schemas.microsoft.com/office/word/2006/wordml" xmlns:wps="http://schemas.microsoft.com/office/word/2010/wordprocessingShape" mc:Ignorable="w14 w15 w16se w16cid w16 w16cex w16sdtdh w16sdtfl w16du wp14">
+<w:numbering xmlns:wpc="http://schemas.microsoft.com/office/word/2010/wordprocessingCanvas" xmlns:cx="http://schemas.microsoft.com/office/drawing/2014/chartex" xmlns:cx1="http://schemas.microsoft.com/office/drawing/2015/9/8/chartex" xmlns:cx2="http://schemas.microsoft.com/office/drawing/2015/10/21/chartex" xmlns:cx3="http://schemas.microsoft.com/office/drawing/2016/5/9/chartex" xmlns:cx4="http://schemas.microsoft.com/office/drawing/2016/5/10/chartex" xmlns:cx5="http://schemas.microsoft.com/office/drawing/2016/5/11/chartex" xmlns:cx6="http://schemas.microsoft.com/office/drawing/2016/5/12/chartex" xmlns:cx7="http://schemas.microsoft.com/office/drawing/2016/5/13/chartex" xmlns:cx8="http://schemas.microsoft.com/office/drawing/2016/5/14/chartex" xmlns:mc="http://schemas.openxmlformats.org/markup-compatibility/2006" xmlns:aink="http://schemas.microsoft.com/office/drawing/2016/ink" xmlns:am3d="http://schemas.microsoft.com/office/drawing/2017/model3d" xmlns:o="urn:schemas-microsoft-com:office:office" xmlns:oel="http://schemas.microsoft.com/office/2019/extlst" xmlns:r="http://schemas.openxmlformats.org/officeDocument/2006/relationships" xmlns:m="http://schemas.openxmlformats.org/officeDocument/2006/math" xmlns:v="urn:schemas-microsoft-com:vml" xmlns:wp14="http://schemas.microsoft.com/office/word/2010/wordprocessingDrawing" xmlns:wp="http://schemas.openxmlformats.org/drawingml/2006/wordprocessingDrawing" xmlns:w10="urn:schemas-microsoft-com:office:word" xmlns:w="http://schemas.openxmlformats.org/wordprocessingml/2006/main" xmlns:w14="http://schemas.microsoft.com/office/word/2010/wordml" xmlns:w15="http://schemas.microsoft.com/office/word/2012/wordml" xmlns:w16cei="http://schemas.microsoft.com/office/word/2026/wordml/cei" xmlns:w16cex="http://schemas.microsoft.com/office/word/2018/wordml/cex" xmlns:w16cid="http://schemas.microsoft.com/office/word/2016/wordml/cid" xmlns:w16="http://schemas.microsoft.com/office/word/2018/wordml" xmlns:w16du="http://schemas.microsoft.com/office/word/2023/wordml/word16du" xmlns:w16sdtdh="http://schemas.microsoft.com/office/word/2020/wordml/sdtdatahash" xmlns:w16sdtfl="http://schemas.microsoft.com/office/word/2024/wordml/sdtformatlock" xmlns:w16se="http://schemas.microsoft.com/office/word/2015/wordml/symex" xmlns:wpg="http://schemas.microsoft.com/office/word/2010/wordprocessingGroup" xmlns:wpi="http://schemas.microsoft.com/office/word/2010/wordprocessingInk" xmlns:wne="http://schemas.microsoft.com/office/word/2006/wordml" xmlns:wps="http://schemas.microsoft.com/office/word/2010/wordprocessingShape" mc:Ignorable="w14 w15 w16se w16cid w16 w16cex w16sdtdh w16sdtfl w16du wp14">
   <w:abstractNum w:abstractNumId="0" w15:restartNumberingAfterBreak="0">
     <w:nsid w:val="17473B79"/>
     <w:multiLevelType w:val="hybridMultilevel"/>
@@ -2465,6 +2424,7 @@
   <w:style w:type="character" w:default="1" w:styleId="Fuentedeprrafopredeter">
     <w:name w:val="Default Paragraph Font"/>
     <w:uiPriority w:val="1"/>
+    <w:semiHidden/>
     <w:unhideWhenUsed/>
   </w:style>
   <w:style w:type="table" w:default="1" w:styleId="Tablanormal">

</xml_diff>